<commit_message>
First render commit see how it looks
</commit_message>
<xml_diff>
--- a/references/reference.docx
+++ b/references/reference.docx
@@ -4,15 +4,31 @@
   <w:body>
     <w:p>
       <w:pPr>
-        <w:spacing w:line="360" w:lineRule="auto"/>
+        <w:pStyle w:val="Title"/>
       </w:pPr>
     </w:p>
     <w:p>
       <w:pPr>
-        <w:spacing w:line="360" w:lineRule="auto"/>
+        <w:pStyle w:val="Heading1"/>
       </w:pPr>
+      <w:r>
+        <w:t>Title</w:t>
+      </w:r>
     </w:p>
+    <w:p>
+      <w:pPr>
+        <w:pStyle w:val="Heading2"/>
+      </w:pPr>
+      <w:r>
+        <w:t>Subtitle</w:t>
+      </w:r>
+    </w:p>
+    <w:p/>
+    <w:p/>
+    <w:p/>
+    <w:p/>
     <w:sectPr>
+      <w:footerReference w:type="default" r:id="rId7"/>
       <w:pgSz w:w="11906" w:h="16838"/>
       <w:pgMar w:top="1440" w:right="1440" w:bottom="1440" w:left="1440" w:header="708" w:footer="708" w:gutter="0"/>
       <w:lnNumType w:countBy="1" w:restart="continuous"/>
@@ -21,6 +37,109 @@
     </w:sectPr>
   </w:body>
 </w:document>
+</file>
+
+<file path=word/endnotes.xml><?xml version="1.0" encoding="utf-8"?>
+<w:endnotes xmlns:wpc="http://schemas.microsoft.com/office/word/2010/wordprocessingCanvas" xmlns:cx="http://schemas.microsoft.com/office/drawing/2014/chartex" xmlns:cx1="http://schemas.microsoft.com/office/drawing/2015/9/8/chartex" xmlns:cx2="http://schemas.microsoft.com/office/drawing/2015/10/21/chartex" xmlns:cx3="http://schemas.microsoft.com/office/drawing/2016/5/9/chartex" xmlns:cx4="http://schemas.microsoft.com/office/drawing/2016/5/10/chartex" xmlns:cx5="http://schemas.microsoft.com/office/drawing/2016/5/11/chartex" xmlns:cx6="http://schemas.microsoft.com/office/drawing/2016/5/12/chartex" xmlns:cx7="http://schemas.microsoft.com/office/drawing/2016/5/13/chartex" xmlns:cx8="http://schemas.microsoft.com/office/drawing/2016/5/14/chartex" xmlns:mc="http://schemas.openxmlformats.org/markup-compatibility/2006" xmlns:aink="http://schemas.microsoft.com/office/drawing/2016/ink" xmlns:am3d="http://schemas.microsoft.com/office/drawing/2017/model3d" xmlns:o="urn:schemas-microsoft-com:office:office" xmlns:oel="http://schemas.microsoft.com/office/2019/extlst" xmlns:r="http://schemas.openxmlformats.org/officeDocument/2006/relationships" xmlns:m="http://schemas.openxmlformats.org/officeDocument/2006/math" xmlns:v="urn:schemas-microsoft-com:vml" xmlns:wp14="http://schemas.microsoft.com/office/word/2010/wordprocessingDrawing" xmlns:wp="http://schemas.openxmlformats.org/drawingml/2006/wordprocessingDrawing" xmlns:w10="urn:schemas-microsoft-com:office:word" xmlns:w="http://schemas.openxmlformats.org/wordprocessingml/2006/main" xmlns:w14="http://schemas.microsoft.com/office/word/2010/wordml" xmlns:w15="http://schemas.microsoft.com/office/word/2012/wordml" xmlns:w16cex="http://schemas.microsoft.com/office/word/2018/wordml/cex" xmlns:w16cid="http://schemas.microsoft.com/office/word/2016/wordml/cid" xmlns:w16="http://schemas.microsoft.com/office/word/2018/wordml" xmlns:w16du="http://schemas.microsoft.com/office/word/2023/wordml/word16du" xmlns:w16sdtdh="http://schemas.microsoft.com/office/word/2020/wordml/sdtdatahash" xmlns:w16sdtfl="http://schemas.microsoft.com/office/word/2024/wordml/sdtformatlock" xmlns:w16se="http://schemas.microsoft.com/office/word/2015/wordml/symex" xmlns:wpg="http://schemas.microsoft.com/office/word/2010/wordprocessingGroup" xmlns:wpi="http://schemas.microsoft.com/office/word/2010/wordprocessingInk" xmlns:wne="http://schemas.microsoft.com/office/word/2006/wordml" xmlns:wps="http://schemas.microsoft.com/office/word/2010/wordprocessingShape" mc:Ignorable="w14 w15 w16se w16cid w16 w16cex w16sdtdh w16sdtfl w16du wp14">
+  <w:endnote w:type="separator" w:id="-1">
+    <w:p>
+      <w:pPr>
+        <w:spacing w:after="0" w:line="240" w:lineRule="auto"/>
+      </w:pPr>
+      <w:r>
+        <w:separator/>
+      </w:r>
+    </w:p>
+  </w:endnote>
+  <w:endnote w:type="continuationSeparator" w:id="0">
+    <w:p>
+      <w:pPr>
+        <w:spacing w:after="0" w:line="240" w:lineRule="auto"/>
+      </w:pPr>
+      <w:r>
+        <w:continuationSeparator/>
+      </w:r>
+    </w:p>
+  </w:endnote>
+</w:endnotes>
+</file>
+
+<file path=word/footer1.xml><?xml version="1.0" encoding="utf-8"?>
+<w:ftr xmlns:wpc="http://schemas.microsoft.com/office/word/2010/wordprocessingCanvas" xmlns:cx="http://schemas.microsoft.com/office/drawing/2014/chartex" xmlns:cx1="http://schemas.microsoft.com/office/drawing/2015/9/8/chartex" xmlns:cx2="http://schemas.microsoft.com/office/drawing/2015/10/21/chartex" xmlns:cx3="http://schemas.microsoft.com/office/drawing/2016/5/9/chartex" xmlns:cx4="http://schemas.microsoft.com/office/drawing/2016/5/10/chartex" xmlns:cx5="http://schemas.microsoft.com/office/drawing/2016/5/11/chartex" xmlns:cx6="http://schemas.microsoft.com/office/drawing/2016/5/12/chartex" xmlns:cx7="http://schemas.microsoft.com/office/drawing/2016/5/13/chartex" xmlns:cx8="http://schemas.microsoft.com/office/drawing/2016/5/14/chartex" xmlns:mc="http://schemas.openxmlformats.org/markup-compatibility/2006" xmlns:aink="http://schemas.microsoft.com/office/drawing/2016/ink" xmlns:am3d="http://schemas.microsoft.com/office/drawing/2017/model3d" xmlns:o="urn:schemas-microsoft-com:office:office" xmlns:oel="http://schemas.microsoft.com/office/2019/extlst" xmlns:r="http://schemas.openxmlformats.org/officeDocument/2006/relationships" xmlns:m="http://schemas.openxmlformats.org/officeDocument/2006/math" xmlns:v="urn:schemas-microsoft-com:vml" xmlns:wp14="http://schemas.microsoft.com/office/word/2010/wordprocessingDrawing" xmlns:wp="http://schemas.openxmlformats.org/drawingml/2006/wordprocessingDrawing" xmlns:w10="urn:schemas-microsoft-com:office:word" xmlns:w="http://schemas.openxmlformats.org/wordprocessingml/2006/main" xmlns:w14="http://schemas.microsoft.com/office/word/2010/wordml" xmlns:w15="http://schemas.microsoft.com/office/word/2012/wordml" xmlns:w16cex="http://schemas.microsoft.com/office/word/2018/wordml/cex" xmlns:w16cid="http://schemas.microsoft.com/office/word/2016/wordml/cid" xmlns:w16="http://schemas.microsoft.com/office/word/2018/wordml" xmlns:w16du="http://schemas.microsoft.com/office/word/2023/wordml/word16du" xmlns:w16sdtdh="http://schemas.microsoft.com/office/word/2020/wordml/sdtdatahash" xmlns:w16sdtfl="http://schemas.microsoft.com/office/word/2024/wordml/sdtformatlock" xmlns:w16se="http://schemas.microsoft.com/office/word/2015/wordml/symex" xmlns:wpg="http://schemas.microsoft.com/office/word/2010/wordprocessingGroup" xmlns:wpi="http://schemas.microsoft.com/office/word/2010/wordprocessingInk" xmlns:wne="http://schemas.microsoft.com/office/word/2006/wordml" xmlns:wps="http://schemas.microsoft.com/office/word/2010/wordprocessingShape" mc:Ignorable="w14 w15 w16se w16cid w16 w16cex w16sdtdh w16sdtfl w16du wp14">
+  <w:sdt>
+    <w:sdtPr>
+      <w:id w:val="1297336177"/>
+      <w:docPartObj>
+        <w:docPartGallery w:val="Page Numbers (Bottom of Page)"/>
+        <w:docPartUnique/>
+      </w:docPartObj>
+    </w:sdtPr>
+    <w:sdtEndPr>
+      <w:rPr>
+        <w:noProof/>
+      </w:rPr>
+    </w:sdtEndPr>
+    <w:sdtContent>
+      <w:p>
+        <w:pPr>
+          <w:pStyle w:val="Footer"/>
+          <w:jc w:val="center"/>
+        </w:pPr>
+        <w:r>
+          <w:fldChar w:fldCharType="begin"/>
+        </w:r>
+        <w:r>
+          <w:instrText xml:space="preserve"> PAGE   \* MERGEFORMAT </w:instrText>
+        </w:r>
+        <w:r>
+          <w:fldChar w:fldCharType="separate"/>
+        </w:r>
+        <w:r>
+          <w:rPr>
+            <w:noProof/>
+          </w:rPr>
+          <w:t>2</w:t>
+        </w:r>
+        <w:r>
+          <w:rPr>
+            <w:noProof/>
+          </w:rPr>
+          <w:fldChar w:fldCharType="end"/>
+        </w:r>
+      </w:p>
+    </w:sdtContent>
+  </w:sdt>
+  <w:p>
+    <w:pPr>
+      <w:pStyle w:val="Footer"/>
+    </w:pPr>
+  </w:p>
+</w:ftr>
+</file>
+
+<file path=word/footnotes.xml><?xml version="1.0" encoding="utf-8"?>
+<w:footnotes xmlns:wpc="http://schemas.microsoft.com/office/word/2010/wordprocessingCanvas" xmlns:cx="http://schemas.microsoft.com/office/drawing/2014/chartex" xmlns:cx1="http://schemas.microsoft.com/office/drawing/2015/9/8/chartex" xmlns:cx2="http://schemas.microsoft.com/office/drawing/2015/10/21/chartex" xmlns:cx3="http://schemas.microsoft.com/office/drawing/2016/5/9/chartex" xmlns:cx4="http://schemas.microsoft.com/office/drawing/2016/5/10/chartex" xmlns:cx5="http://schemas.microsoft.com/office/drawing/2016/5/11/chartex" xmlns:cx6="http://schemas.microsoft.com/office/drawing/2016/5/12/chartex" xmlns:cx7="http://schemas.microsoft.com/office/drawing/2016/5/13/chartex" xmlns:cx8="http://schemas.microsoft.com/office/drawing/2016/5/14/chartex" xmlns:mc="http://schemas.openxmlformats.org/markup-compatibility/2006" xmlns:aink="http://schemas.microsoft.com/office/drawing/2016/ink" xmlns:am3d="http://schemas.microsoft.com/office/drawing/2017/model3d" xmlns:o="urn:schemas-microsoft-com:office:office" xmlns:oel="http://schemas.microsoft.com/office/2019/extlst" xmlns:r="http://schemas.openxmlformats.org/officeDocument/2006/relationships" xmlns:m="http://schemas.openxmlformats.org/officeDocument/2006/math" xmlns:v="urn:schemas-microsoft-com:vml" xmlns:wp14="http://schemas.microsoft.com/office/word/2010/wordprocessingDrawing" xmlns:wp="http://schemas.openxmlformats.org/drawingml/2006/wordprocessingDrawing" xmlns:w10="urn:schemas-microsoft-com:office:word" xmlns:w="http://schemas.openxmlformats.org/wordprocessingml/2006/main" xmlns:w14="http://schemas.microsoft.com/office/word/2010/wordml" xmlns:w15="http://schemas.microsoft.com/office/word/2012/wordml" xmlns:w16cex="http://schemas.microsoft.com/office/word/2018/wordml/cex" xmlns:w16cid="http://schemas.microsoft.com/office/word/2016/wordml/cid" xmlns:w16="http://schemas.microsoft.com/office/word/2018/wordml" xmlns:w16du="http://schemas.microsoft.com/office/word/2023/wordml/word16du" xmlns:w16sdtdh="http://schemas.microsoft.com/office/word/2020/wordml/sdtdatahash" xmlns:w16sdtfl="http://schemas.microsoft.com/office/word/2024/wordml/sdtformatlock" xmlns:w16se="http://schemas.microsoft.com/office/word/2015/wordml/symex" xmlns:wpg="http://schemas.microsoft.com/office/word/2010/wordprocessingGroup" xmlns:wpi="http://schemas.microsoft.com/office/word/2010/wordprocessingInk" xmlns:wne="http://schemas.microsoft.com/office/word/2006/wordml" xmlns:wps="http://schemas.microsoft.com/office/word/2010/wordprocessingShape" mc:Ignorable="w14 w15 w16se w16cid w16 w16cex w16sdtdh w16sdtfl w16du wp14">
+  <w:footnote w:type="separator" w:id="-1">
+    <w:p>
+      <w:pPr>
+        <w:spacing w:after="0" w:line="240" w:lineRule="auto"/>
+      </w:pPr>
+      <w:r>
+        <w:separator/>
+      </w:r>
+    </w:p>
+  </w:footnote>
+  <w:footnote w:type="continuationSeparator" w:id="0">
+    <w:p>
+      <w:pPr>
+        <w:spacing w:after="0" w:line="240" w:lineRule="auto"/>
+      </w:pPr>
+      <w:r>
+        <w:continuationSeparator/>
+      </w:r>
+    </w:p>
+  </w:footnote>
+</w:footnotes>
 </file>
 
 <file path=word/styles.xml><?xml version="1.0" encoding="utf-8"?>
@@ -423,6 +542,10 @@
   <w:style w:type="paragraph" w:default="1" w:styleId="Normal">
     <w:name w:val="Normal"/>
     <w:qFormat/>
+    <w:rsid w:val="00E2075A"/>
+    <w:pPr>
+      <w:spacing w:line="360" w:lineRule="auto"/>
+    </w:pPr>
     <w:rPr>
       <w:lang w:val="en-GB"/>
     </w:rPr>
@@ -434,17 +557,17 @@
     <w:link w:val="Heading1Char"/>
     <w:uiPriority w:val="9"/>
     <w:qFormat/>
-    <w:rsid w:val="009B7F83"/>
+    <w:rsid w:val="00FB5FD4"/>
     <w:pPr>
       <w:keepNext/>
       <w:keepLines/>
-      <w:spacing w:before="360" w:after="80"/>
+      <w:spacing w:before="120" w:after="120" w:line="240" w:lineRule="auto"/>
       <w:outlineLvl w:val="0"/>
     </w:pPr>
     <w:rPr>
-      <w:rFonts w:asciiTheme="majorHAnsi" w:eastAsiaTheme="majorEastAsia" w:hAnsiTheme="majorHAnsi" w:cstheme="majorBidi"/>
-      <w:color w:val="2F5496" w:themeColor="accent1" w:themeShade="BF"/>
-      <w:sz w:val="40"/>
+      <w:rFonts w:eastAsiaTheme="majorEastAsia" w:cstheme="majorBidi"/>
+      <w:b/>
+      <w:sz w:val="28"/>
       <w:szCs w:val="40"/>
     </w:rPr>
   </w:style>
@@ -454,20 +577,19 @@
     <w:next w:val="Normal"/>
     <w:link w:val="Heading2Char"/>
     <w:uiPriority w:val="9"/>
-    <w:semiHidden/>
     <w:unhideWhenUsed/>
     <w:qFormat/>
-    <w:rsid w:val="009B7F83"/>
+    <w:rsid w:val="00FB5FD4"/>
     <w:pPr>
       <w:keepNext/>
       <w:keepLines/>
-      <w:spacing w:before="160" w:after="80"/>
+      <w:spacing w:before="120" w:after="120" w:line="240" w:lineRule="auto"/>
       <w:outlineLvl w:val="1"/>
     </w:pPr>
     <w:rPr>
-      <w:rFonts w:asciiTheme="majorHAnsi" w:eastAsiaTheme="majorEastAsia" w:hAnsiTheme="majorHAnsi" w:cstheme="majorBidi"/>
-      <w:color w:val="2F5496" w:themeColor="accent1" w:themeShade="BF"/>
-      <w:sz w:val="32"/>
+      <w:rFonts w:eastAsiaTheme="majorEastAsia" w:cstheme="majorBidi"/>
+      <w:b/>
+      <w:sz w:val="24"/>
       <w:szCs w:val="32"/>
     </w:rPr>
   </w:style>
@@ -658,11 +780,11 @@
     <w:basedOn w:val="DefaultParagraphFont"/>
     <w:link w:val="Heading1"/>
     <w:uiPriority w:val="9"/>
-    <w:rsid w:val="009B7F83"/>
-    <w:rPr>
-      <w:rFonts w:asciiTheme="majorHAnsi" w:eastAsiaTheme="majorEastAsia" w:hAnsiTheme="majorHAnsi" w:cstheme="majorBidi"/>
-      <w:color w:val="2F5496" w:themeColor="accent1" w:themeShade="BF"/>
-      <w:sz w:val="40"/>
+    <w:rsid w:val="00FB5FD4"/>
+    <w:rPr>
+      <w:rFonts w:eastAsiaTheme="majorEastAsia" w:cstheme="majorBidi"/>
+      <w:b/>
+      <w:sz w:val="28"/>
       <w:szCs w:val="40"/>
       <w:lang w:val="en-GB"/>
     </w:rPr>
@@ -672,12 +794,11 @@
     <w:basedOn w:val="DefaultParagraphFont"/>
     <w:link w:val="Heading2"/>
     <w:uiPriority w:val="9"/>
-    <w:semiHidden/>
-    <w:rsid w:val="009B7F83"/>
-    <w:rPr>
-      <w:rFonts w:asciiTheme="majorHAnsi" w:eastAsiaTheme="majorEastAsia" w:hAnsiTheme="majorHAnsi" w:cstheme="majorBidi"/>
-      <w:color w:val="2F5496" w:themeColor="accent1" w:themeShade="BF"/>
-      <w:sz w:val="32"/>
+    <w:rsid w:val="00FB5FD4"/>
+    <w:rPr>
+      <w:rFonts w:eastAsiaTheme="majorEastAsia" w:cstheme="majorBidi"/>
+      <w:b/>
+      <w:sz w:val="24"/>
       <w:szCs w:val="32"/>
       <w:lang w:val="en-GB"/>
     </w:rPr>
@@ -788,16 +909,17 @@
     <w:link w:val="TitleChar"/>
     <w:uiPriority w:val="10"/>
     <w:qFormat/>
-    <w:rsid w:val="009B7F83"/>
+    <w:rsid w:val="00480FBF"/>
     <w:pPr>
       <w:spacing w:after="80" w:line="240" w:lineRule="auto"/>
       <w:contextualSpacing/>
     </w:pPr>
     <w:rPr>
-      <w:rFonts w:asciiTheme="majorHAnsi" w:eastAsiaTheme="majorEastAsia" w:hAnsiTheme="majorHAnsi" w:cstheme="majorBidi"/>
+      <w:rFonts w:eastAsiaTheme="majorEastAsia" w:cstheme="majorBidi"/>
+      <w:b/>
       <w:spacing w:val="-10"/>
       <w:kern w:val="28"/>
-      <w:sz w:val="56"/>
+      <w:sz w:val="36"/>
       <w:szCs w:val="56"/>
     </w:rPr>
   </w:style>
@@ -806,12 +928,13 @@
     <w:basedOn w:val="DefaultParagraphFont"/>
     <w:link w:val="Title"/>
     <w:uiPriority w:val="10"/>
-    <w:rsid w:val="009B7F83"/>
-    <w:rPr>
-      <w:rFonts w:asciiTheme="majorHAnsi" w:eastAsiaTheme="majorEastAsia" w:hAnsiTheme="majorHAnsi" w:cstheme="majorBidi"/>
+    <w:rsid w:val="00480FBF"/>
+    <w:rPr>
+      <w:rFonts w:eastAsiaTheme="majorEastAsia" w:cstheme="majorBidi"/>
+      <w:b/>
       <w:spacing w:val="-10"/>
       <w:kern w:val="28"/>
-      <w:sz w:val="56"/>
+      <w:sz w:val="36"/>
       <w:szCs w:val="56"/>
       <w:lang w:val="en-GB"/>
     </w:rPr>
@@ -963,6 +1086,56 @@
     <w:semiHidden/>
     <w:unhideWhenUsed/>
     <w:rsid w:val="009B7F83"/>
+  </w:style>
+  <w:style w:type="paragraph" w:styleId="Header">
+    <w:name w:val="header"/>
+    <w:basedOn w:val="Normal"/>
+    <w:link w:val="HeaderChar"/>
+    <w:uiPriority w:val="99"/>
+    <w:unhideWhenUsed/>
+    <w:rsid w:val="0051102F"/>
+    <w:pPr>
+      <w:tabs>
+        <w:tab w:val="center" w:pos="4513"/>
+        <w:tab w:val="right" w:pos="9026"/>
+      </w:tabs>
+      <w:spacing w:after="0" w:line="240" w:lineRule="auto"/>
+    </w:pPr>
+  </w:style>
+  <w:style w:type="character" w:customStyle="1" w:styleId="HeaderChar">
+    <w:name w:val="Header Char"/>
+    <w:basedOn w:val="DefaultParagraphFont"/>
+    <w:link w:val="Header"/>
+    <w:uiPriority w:val="99"/>
+    <w:rsid w:val="0051102F"/>
+    <w:rPr>
+      <w:lang w:val="en-GB"/>
+    </w:rPr>
+  </w:style>
+  <w:style w:type="paragraph" w:styleId="Footer">
+    <w:name w:val="footer"/>
+    <w:basedOn w:val="Normal"/>
+    <w:link w:val="FooterChar"/>
+    <w:uiPriority w:val="99"/>
+    <w:unhideWhenUsed/>
+    <w:rsid w:val="0051102F"/>
+    <w:pPr>
+      <w:tabs>
+        <w:tab w:val="center" w:pos="4513"/>
+        <w:tab w:val="right" w:pos="9026"/>
+      </w:tabs>
+      <w:spacing w:after="0" w:line="240" w:lineRule="auto"/>
+    </w:pPr>
+  </w:style>
+  <w:style w:type="character" w:customStyle="1" w:styleId="FooterChar">
+    <w:name w:val="Footer Char"/>
+    <w:basedOn w:val="DefaultParagraphFont"/>
+    <w:link w:val="Footer"/>
+    <w:uiPriority w:val="99"/>
+    <w:rsid w:val="0051102F"/>
+    <w:rPr>
+      <w:lang w:val="en-GB"/>
+    </w:rPr>
   </w:style>
 </w:styles>
 </file>
@@ -1272,4 +1445,10 @@
     <ds:schemaRef ds:uri="http://schemas.openxmlformats.org/officeDocument/2006/bibliography"/>
   </ds:schemaRefs>
 </ds:datastoreItem>
+</file>
+
+<file path=docMetadata/LabelInfo.xml><?xml version="1.0" encoding="utf-8"?>
+<clbl:labelList xmlns:clbl="http://schemas.microsoft.com/office/2020/mipLabelMetadata">
+  <clbl:label id="{220f5dc3-9452-48e5-9b4f-888df42f7a2d}" enabled="0" method="" siteId="{220f5dc3-9452-48e5-9b4f-888df42f7a2d}" removed="1"/>
+</clbl:labelList>
 </file>
</xml_diff>